<commit_message>
Guadalquivir paper and technical report v2.0: GloFAS 4.0 against 5.0 (section 4.5, Table 4, Figure 7), Zenodo metadata and citation updated
</commit_message>
<xml_diff>
--- a/spain-guadalquivir-flood-triggers/paper/paper.docx
+++ b/spain-guadalquivir-flood-triggers/paper/paper.docx
@@ -7,16 +7,16 @@
         <w:pStyle w:val="FirstParagraph"/>
       </w:pPr>
       <w:r>
-        <w:t xml:space="preserve">Research paper · version 1.0 · 30 October 2026</w:t>
+        <w:t xml:space="preserve">Research paper · version 2.0 · 30 October 2026</w:t>
       </w:r>
     </w:p>
-    <w:bookmarkStart w:id="56" w:name="X176e61d4ccbf0cef645ad731e38bfb5839d2806"/>
+    <w:bookmarkStart w:id="60" w:name="X88d1463cdc2a8153b4c66ac1f0e3d1612760b64"/>
     <w:p>
       <w:pPr>
         <w:pStyle w:val="Heading1"/>
       </w:pPr>
       <w:r>
-        <w:t xml:space="preserve">River flow or rainfall? Writing parametric flood triggers from global data, tested gauge by gauge in the Guadalquivir basin, Spain</w:t>
+        <w:t xml:space="preserve">River flow or rainfall, GloFAS 4.0 or 5.0? Writing parametric flood triggers from global data, tested gauge by gauge in the Guadalquivir basin, Spain</w:t>
       </w:r>
     </w:p>
     <w:p>
@@ -158,7 +158,31 @@
         <w:t xml:space="preserve"> </w:t>
       </w:r>
       <w:r>
-        <w:t xml:space="preserve">29% of payouts, at the cost of 6 flood years. Basis</w:t>
+        <w:t xml:space="preserve">29% of payouts, at the cost of 6 flood years. These results</w:t>
+      </w:r>
+      <w:r>
+        <w:t xml:space="preserve"> </w:t>
+      </w:r>
+      <w:r>
+        <w:t xml:space="preserve">use GloFAS 4.0. Repeated on the same gauge-years with GloFAS 5.0, the model's 10-year flood was 1.05 of the</w:t>
+      </w:r>
+      <w:r>
+        <w:t xml:space="preserve"> </w:t>
+      </w:r>
+      <w:r>
+        <w:t xml:space="preserve">gauged one, and the trigger written in m³/s caught 26 of 60 flood years (Peirce 0.30) against</w:t>
+      </w:r>
+      <w:r>
+        <w:t xml:space="preserve"> </w:t>
+      </w:r>
+      <w:r>
+        <w:t xml:space="preserve">33 for the model's own 1-in-5 level (Peirce 0.40; McNemar p = 0.065): the bias</w:t>
+      </w:r>
+      <w:r>
+        <w:t xml:space="preserve"> </w:t>
+      </w:r>
+      <w:r>
+        <w:t xml:space="preserve">had largely gone, the frequency-based trigger still scored higher, and about half of all payouts were still false. Basis</w:t>
       </w:r>
       <w:r>
         <w:t xml:space="preserve"> </w:t>
@@ -200,7 +224,7 @@
         <w:t xml:space="preserve"> </w:t>
       </w:r>
       <w:r>
-        <w:t xml:space="preserve">parametric insurance; flood trigger; basis risk; GloFAS; rainfall index; NASA POWER; flood frequency; L-moments; verification; Guadalquivir</w:t>
+        <w:t xml:space="preserve">parametric insurance; flood trigger; basis risk; GloFAS; GloFAS 5.0; rainfall index; NASA POWER; flood frequency; L-moments; verification; Guadalquivir</w:t>
       </w:r>
     </w:p>
     <w:bookmarkEnd w:id="20"/>
@@ -480,7 +504,25 @@
         <w:t xml:space="preserve"> </w:t>
       </w:r>
       <w:r>
-        <w:t xml:space="preserve">model's best case; at an ungauged site the cell has to be found from the upstream area alone.</w:t>
+        <w:t xml:space="preserve">model's best case; at an ungauged site the cell has to be found from the upstream area alone. Version 2 of this paper adds</w:t>
+      </w:r>
+      <w:r>
+        <w:t xml:space="preserve"> </w:t>
+      </w:r>
+      <w:r>
+        <w:t xml:space="preserve">the GloFAS reanalysis version 5.0 (consolidated, 0.05°), downloaded for the whole basin from the Copernicus Early Warning Data</w:t>
+      </w:r>
+      <w:r>
+        <w:t xml:space="preserve"> </w:t>
+      </w:r>
+      <w:r>
+        <w:t xml:space="preserve">Store for water years 1984–2022, with cells chosen the same way. GloFAS 5.0 is compared with 4.0 on the same 286 gauge-years</w:t>
+      </w:r>
+      <w:r>
+        <w:t xml:space="preserve"> </w:t>
+      </w:r>
+      <w:r>
+        <w:t xml:space="preserve">(section 4.5); the 39 yearly files are listed with their SHA-256 values in the data package.</w:t>
       </w:r>
     </w:p>
     <w:p>
@@ -1027,7 +1069,7 @@
     </w:p>
     <w:bookmarkEnd w:id="29"/>
     <w:bookmarkEnd w:id="30"/>
-    <w:bookmarkStart w:id="50" w:name="results"/>
+    <w:bookmarkStart w:id="54" w:name="results"/>
     <w:p>
       <w:pPr>
         <w:pStyle w:val="Heading2"/>
@@ -1036,13 +1078,13 @@
         <w:t xml:space="preserve">4. Results</w:t>
       </w:r>
     </w:p>
-    <w:bookmarkStart w:id="37" w:name="X60b40ef914c75b90ca4b69c6580892252cc919a"/>
+    <w:bookmarkStart w:id="37" w:name="X72b9dc9b6366772d71a4609febd14368eb1a0bf"/>
     <w:p>
       <w:pPr>
         <w:pStyle w:val="Heading3"/>
       </w:pPr>
       <w:r>
-        <w:t xml:space="preserve">4.1 The model sees these floods at about a fifth of their size</w:t>
+        <w:t xml:space="preserve">4.1 GloFAS 4.0 sees these floods at about a fifth of their size</w:t>
       </w:r>
     </w:p>
     <w:p>
@@ -8691,14 +8733,13 @@
       </w:r>
     </w:p>
     <w:bookmarkEnd w:id="49"/>
-    <w:bookmarkEnd w:id="50"/>
-    <w:bookmarkStart w:id="51" w:name="discussion"/>
+    <w:bookmarkStart w:id="53" w:name="Xd1b70a81ec72497f6b6a3818d675dc72c847176"/>
     <w:p>
       <w:pPr>
-        <w:pStyle w:val="Heading2"/>
+        <w:pStyle w:val="Heading3"/>
       </w:pPr>
       <w:r>
-        <w:t xml:space="preserve">5. Discussion</w:t>
+        <w:t xml:space="preserve">4.5 GloFAS 5.0: the bias has largely gone; the advice on frequency stands</w:t>
       </w:r>
     </w:p>
     <w:p>
@@ -8706,6 +8747,614 @@
         <w:pStyle w:val="FirstParagraph"/>
       </w:pPr>
       <w:r>
+        <w:t xml:space="preserve">On the same 286 gauge-years, GloFAS 5.0's 10-year flood was 1.05 of the gauged one at the</w:t>
+      </w:r>
+      <w:r>
+        <w:t xml:space="preserve"> </w:t>
+      </w:r>
+      <w:r>
+        <w:t xml:space="preserve">median gauge (4.0: 0.22) and within a factor of 2 at 10 of 14 gauges</w:t>
+      </w:r>
+      <w:r>
+        <w:t xml:space="preserve"> </w:t>
+      </w:r>
+      <w:r>
+        <w:t xml:space="preserve">(4.0: 4); its mean flow was within a factor of 2 at 13 of 14 gauges (Figure 7; Table 4).</w:t>
+      </w:r>
+      <w:r>
+        <w:t xml:space="preserve"> </w:t>
+      </w:r>
+      <w:r>
+        <w:t xml:space="preserve">The model also ranked the big years better (median rank correlation 0.55 against 0.42).</w:t>
+      </w:r>
+      <w:r>
+        <w:t xml:space="preserve"> </w:t>
+      </w:r>
+      <w:r>
+        <w:t xml:space="preserve">With the bias gone, a trigger written in m³/s from a gauge-based design flow worked: at 1-in-5 it caught 26 of 60 flood</w:t>
+      </w:r>
+      <w:r>
+        <w:t xml:space="preserve"> </w:t>
+      </w:r>
+      <w:r>
+        <w:t xml:space="preserve">years (Peirce 0.30; 4.0: 6, 0.06). Written as the model's own 1-in-5 level it caught</w:t>
+      </w:r>
+      <w:r>
+        <w:t xml:space="preserve"> </w:t>
+      </w:r>
+      <w:r>
+        <w:t xml:space="preserve">33 (Peirce 0.40); 9 flood years were caught by the return-period trigger alone and</w:t>
+      </w:r>
+      <w:r>
+        <w:t xml:space="preserve"> </w:t>
+      </w:r>
+      <w:r>
+        <w:t xml:space="preserve">2 by the fixed-flow trigger alone (McNemar p = 0.065). Basis risk did not</w:t>
+      </w:r>
+      <w:r>
+        <w:t xml:space="preserve"> </w:t>
+      </w:r>
+      <w:r>
+        <w:t xml:space="preserve">fall: 34 false payouts for the return-period trigger and 30 for the fixed-flow one, so about half</w:t>
+      </w:r>
+      <w:r>
+        <w:t xml:space="preserve"> </w:t>
+      </w:r>
+      <w:r>
+        <w:t xml:space="preserve">of all payouts were still false. The link between a gauge's rank correlation and the share of floods caught weakened</w:t>
+      </w:r>
+      <w:r>
+        <w:t xml:space="preserve"> </w:t>
+      </w:r>
+      <w:r>
+        <w:t xml:space="preserve">(Spearman ρ = 0.41, p = 0.14). Over every year that GloFAS 5.0 and the</w:t>
+      </w:r>
+      <w:r>
+        <w:t xml:space="preserve"> </w:t>
+      </w:r>
+      <w:r>
+        <w:t xml:space="preserve">gauges both cover (1985–2022, 407 gauge-years, 89 flood years), the return-period trigger</w:t>
+      </w:r>
+      <w:r>
+        <w:t xml:space="preserve"> </w:t>
+      </w:r>
+      <w:r>
+        <w:t xml:space="preserve">caught 53 with 44 false payouts (Peirce 0.46) and the fixed-flow trigger 41</w:t>
+      </w:r>
+      <w:r>
+        <w:t xml:space="preserve"> </w:t>
+      </w:r>
+      <w:r>
+        <w:t xml:space="preserve">with 31 (Peirce 0.36; McNemar p = 0.0075).</w:t>
+      </w:r>
+    </w:p>
+    <w:p>
+      <w:pPr>
+        <w:pStyle w:val="CaptionedFigure"/>
+        <w:keepNext/>
+        <w:jc w:val="center"/>
+      </w:pPr>
+      <w:r>
+        <w:drawing>
+          <wp:inline>
+            <wp:extent cx="6120130" cy="2414362"/>
+            <wp:effectExtent b="0" l="0" r="0" t="0"/>
+            <wp:docPr descr="" title="" id="51" name="Picture"/>
+            <a:graphic>
+              <a:graphicData uri="http://schemas.openxmlformats.org/drawingml/2006/picture">
+                <pic:pic>
+                  <pic:nvPicPr>
+                    <pic:cNvPr descr="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" id="52" name="Picture"/>
+                    <pic:cNvPicPr>
+                      <a:picLocks noChangeArrowheads="1" noChangeAspect="1"/>
+                    </pic:cNvPicPr>
+                  </pic:nvPicPr>
+                  <pic:blipFill>
+                    <a:blip r:embed="rId50"/>
+                    <a:stretch>
+                      <a:fillRect/>
+                    </a:stretch>
+                  </pic:blipFill>
+                  <pic:spPr bwMode="auto">
+                    <a:xfrm>
+                      <a:off x="0" y="0"/>
+                      <a:ext cx="6120130" cy="2414362"/>
+                    </a:xfrm>
+                    <a:prstGeom prst="rect">
+                      <a:avLst/>
+                    </a:prstGeom>
+                    <a:noFill/>
+                    <a:ln w="9525">
+                      <a:noFill/>
+                      <a:headEnd/>
+                      <a:tailEnd/>
+                    </a:ln>
+                  </pic:spPr>
+                </pic:pic>
+              </a:graphicData>
+            </a:graphic>
+          </wp:inline>
+        </w:drawing>
+      </w:r>
+    </w:p>
+    <w:p>
+      <w:pPr>
+        <w:pStyle w:val="ImageCaption"/>
+      </w:pPr>
+      <w:r>
+        <w:rPr>
+          <w:bCs/>
+          <w:b/>
+        </w:rPr>
+        <w:t xml:space="preserve">Figure 7.</w:t>
+      </w:r>
+      <w:r>
+        <w:t xml:space="preserve"> </w:t>
+      </w:r>
+      <w:r>
+        <w:t xml:space="preserve">GloFAS 4.0 against 5.0 on the same 286 gauge-years. Left: the 10-year flood at each gauge against the model (log scales; shading: within a factor of 2). Right: 1-in-5 flood years paid and false payouts, pooled over 14 gauges, for the two ways of writing the trigger.</w:t>
+      </w:r>
+    </w:p>
+    <w:p>
+      <w:pPr>
+        <w:pStyle w:val="BodyText"/>
+      </w:pPr>
+      <w:r>
+        <w:rPr>
+          <w:bCs/>
+          <w:b/>
+        </w:rPr>
+        <w:t xml:space="preserve">Table 4.</w:t>
+      </w:r>
+      <w:r>
+        <w:t xml:space="preserve"> </w:t>
+      </w:r>
+      <w:r>
+        <w:t xml:space="preserve">GloFAS 4.0 and 5.0 on the same 286 gauge-years (60 flood years at 1-in-5).</w:t>
+      </w:r>
+    </w:p>
+    <w:tbl>
+      <w:tblPr>
+        <w:tblStyle w:val="Table"/>
+        <w:tblW w:type="pct" w:w="5000"/>
+        <w:tblLook w:firstRow="1" w:lastRow="0" w:firstColumn="0" w:lastColumn="0" w:noHBand="0" w:noVBand="0" w:val="0020"/>
+        <w:jc w:val="center"/>
+        <w:tblBorders>
+          <w:top w:val="single" w:sz="8" w:color="9AA7BD"/>
+          <w:bottom w:val="single" w:sz="8" w:color="9AA7BD"/>
+          <w:insideH w:val="single" w:sz="2" w:color="9AA7BD"/>
+          <w:left w:val="nil"/>
+          <w:right w:val="nil"/>
+          <w:insideV w:val="nil"/>
+        </w:tblBorders>
+      </w:tblPr>
+      <w:tblGrid>
+        <w:gridCol w:w="2640"/>
+        <w:gridCol w:w="2640"/>
+        <w:gridCol w:w="2640"/>
+      </w:tblGrid>
+      <w:tr>
+        <w:trPr>
+          <w:tblHeader w:val="true"/>
+          <w:cantSplit/>
+          <w:tblHeader/>
+        </w:trPr>
+        <w:tc>
+          <w:tcPr/>
+          <w:p>
+            <w:pPr>
+              <w:pStyle w:val="Compact"/>
+              <w:spacing w:after="0" w:before="20" w:line="240" w:lineRule="auto"/>
+              <w:jc w:val="left"/>
+            </w:pPr>
+            <w:r>
+              <w:rPr>
+                <w:rFonts w:ascii="Arial" w:hAnsi="Arial"/>
+                <w:b/>
+                <w:sz w:val="16"/>
+              </w:rPr>
+              <w:t xml:space="preserve">Measure</w:t>
+            </w:r>
+          </w:p>
+        </w:tc>
+        <w:tc>
+          <w:tcPr/>
+          <w:p>
+            <w:pPr>
+              <w:pStyle w:val="Compact"/>
+              <w:spacing w:after="0" w:before="20" w:line="240" w:lineRule="auto"/>
+              <w:jc w:val="left"/>
+            </w:pPr>
+            <w:r>
+              <w:rPr>
+                <w:rFonts w:ascii="Arial" w:hAnsi="Arial"/>
+                <w:b/>
+                <w:sz w:val="16"/>
+              </w:rPr>
+              <w:t xml:space="preserve">GloFAS 4.0</w:t>
+            </w:r>
+          </w:p>
+        </w:tc>
+        <w:tc>
+          <w:tcPr/>
+          <w:p>
+            <w:pPr>
+              <w:pStyle w:val="Compact"/>
+              <w:spacing w:after="0" w:before="20" w:line="240" w:lineRule="auto"/>
+              <w:jc w:val="left"/>
+            </w:pPr>
+            <w:r>
+              <w:rPr>
+                <w:rFonts w:ascii="Arial" w:hAnsi="Arial"/>
+                <w:b/>
+                <w:sz w:val="16"/>
+              </w:rPr>
+              <w:t xml:space="preserve">GloFAS 5.0</w:t>
+            </w:r>
+          </w:p>
+        </w:tc>
+      </w:tr>
+      <w:tr>
+        <w:trPr>
+          <w:cantSplit/>
+        </w:trPr>
+        <w:tc>
+          <w:tcPr/>
+          <w:p>
+            <w:pPr>
+              <w:pStyle w:val="Compact"/>
+              <w:spacing w:after="0" w:before="20" w:line="240" w:lineRule="auto"/>
+              <w:jc w:val="left"/>
+            </w:pPr>
+            <w:r>
+              <w:rPr>
+                <w:rFonts w:ascii="Arial" w:hAnsi="Arial"/>
+                <w:sz w:val="16"/>
+              </w:rPr>
+              <w:t xml:space="preserve">10-year flood, model ÷ gauge (median)</w:t>
+            </w:r>
+          </w:p>
+        </w:tc>
+        <w:tc>
+          <w:tcPr/>
+          <w:p>
+            <w:pPr>
+              <w:pStyle w:val="Compact"/>
+              <w:spacing w:after="0" w:before="20" w:line="240" w:lineRule="auto"/>
+              <w:jc w:val="left"/>
+            </w:pPr>
+            <w:r>
+              <w:rPr>
+                <w:rFonts w:ascii="Arial" w:hAnsi="Arial"/>
+                <w:sz w:val="16"/>
+              </w:rPr>
+              <w:t xml:space="preserve">0.22</w:t>
+            </w:r>
+          </w:p>
+        </w:tc>
+        <w:tc>
+          <w:tcPr/>
+          <w:p>
+            <w:pPr>
+              <w:pStyle w:val="Compact"/>
+              <w:spacing w:after="0" w:before="20" w:line="240" w:lineRule="auto"/>
+              <w:jc w:val="left"/>
+            </w:pPr>
+            <w:r>
+              <w:rPr>
+                <w:rFonts w:ascii="Arial" w:hAnsi="Arial"/>
+                <w:sz w:val="16"/>
+              </w:rPr>
+              <w:t xml:space="preserve">1.05</w:t>
+            </w:r>
+          </w:p>
+        </w:tc>
+      </w:tr>
+      <w:tr>
+        <w:trPr>
+          <w:cantSplit/>
+        </w:trPr>
+        <w:tc>
+          <w:tcPr/>
+          <w:p>
+            <w:pPr>
+              <w:pStyle w:val="Compact"/>
+              <w:spacing w:after="0" w:before="20" w:line="240" w:lineRule="auto"/>
+              <w:jc w:val="left"/>
+            </w:pPr>
+            <w:r>
+              <w:rPr>
+                <w:rFonts w:ascii="Arial" w:hAnsi="Arial"/>
+                <w:sz w:val="16"/>
+              </w:rPr>
+              <w:t xml:space="preserve">Gauges with the 10-year flood within ×2</w:t>
+            </w:r>
+          </w:p>
+        </w:tc>
+        <w:tc>
+          <w:tcPr/>
+          <w:p>
+            <w:pPr>
+              <w:pStyle w:val="Compact"/>
+              <w:spacing w:after="0" w:before="20" w:line="240" w:lineRule="auto"/>
+              <w:jc w:val="left"/>
+            </w:pPr>
+            <w:r>
+              <w:rPr>
+                <w:rFonts w:ascii="Arial" w:hAnsi="Arial"/>
+                <w:sz w:val="16"/>
+              </w:rPr>
+              <w:t xml:space="preserve">4</w:t>
+            </w:r>
+          </w:p>
+        </w:tc>
+        <w:tc>
+          <w:tcPr/>
+          <w:p>
+            <w:pPr>
+              <w:pStyle w:val="Compact"/>
+              <w:spacing w:after="0" w:before="20" w:line="240" w:lineRule="auto"/>
+              <w:jc w:val="left"/>
+            </w:pPr>
+            <w:r>
+              <w:rPr>
+                <w:rFonts w:ascii="Arial" w:hAnsi="Arial"/>
+                <w:sz w:val="16"/>
+              </w:rPr>
+              <w:t xml:space="preserve">10</w:t>
+            </w:r>
+          </w:p>
+        </w:tc>
+      </w:tr>
+      <w:tr>
+        <w:trPr>
+          <w:cantSplit/>
+        </w:trPr>
+        <w:tc>
+          <w:tcPr/>
+          <w:p>
+            <w:pPr>
+              <w:pStyle w:val="Compact"/>
+              <w:spacing w:after="0" w:before="20" w:line="240" w:lineRule="auto"/>
+              <w:jc w:val="left"/>
+            </w:pPr>
+            <w:r>
+              <w:rPr>
+                <w:rFonts w:ascii="Arial" w:hAnsi="Arial"/>
+                <w:sz w:val="16"/>
+              </w:rPr>
+              <w:t xml:space="preserve">Rank correlation of annual maxima (median)</w:t>
+            </w:r>
+          </w:p>
+        </w:tc>
+        <w:tc>
+          <w:tcPr/>
+          <w:p>
+            <w:pPr>
+              <w:pStyle w:val="Compact"/>
+              <w:spacing w:after="0" w:before="20" w:line="240" w:lineRule="auto"/>
+              <w:jc w:val="left"/>
+            </w:pPr>
+            <w:r>
+              <w:rPr>
+                <w:rFonts w:ascii="Arial" w:hAnsi="Arial"/>
+                <w:sz w:val="16"/>
+              </w:rPr>
+              <w:t xml:space="preserve">0.42</w:t>
+            </w:r>
+          </w:p>
+        </w:tc>
+        <w:tc>
+          <w:tcPr/>
+          <w:p>
+            <w:pPr>
+              <w:pStyle w:val="Compact"/>
+              <w:spacing w:after="0" w:before="20" w:line="240" w:lineRule="auto"/>
+              <w:jc w:val="left"/>
+            </w:pPr>
+            <w:r>
+              <w:rPr>
+                <w:rFonts w:ascii="Arial" w:hAnsi="Arial"/>
+                <w:sz w:val="16"/>
+              </w:rPr>
+              <w:t xml:space="preserve">0.55</w:t>
+            </w:r>
+          </w:p>
+        </w:tc>
+      </w:tr>
+      <w:tr>
+        <w:trPr>
+          <w:cantSplit/>
+        </w:trPr>
+        <w:tc>
+          <w:tcPr/>
+          <w:p>
+            <w:pPr>
+              <w:pStyle w:val="Compact"/>
+              <w:spacing w:after="0" w:before="20" w:line="240" w:lineRule="auto"/>
+              <w:jc w:val="left"/>
+            </w:pPr>
+            <w:r>
+              <w:rPr>
+                <w:rFonts w:ascii="Arial" w:hAnsi="Arial"/>
+                <w:sz w:val="16"/>
+              </w:rPr>
+              <w:t xml:space="preserve">Return period: caught · false payouts · Peirce</w:t>
+            </w:r>
+          </w:p>
+        </w:tc>
+        <w:tc>
+          <w:tcPr/>
+          <w:p>
+            <w:pPr>
+              <w:pStyle w:val="Compact"/>
+              <w:spacing w:after="0" w:before="20" w:line="240" w:lineRule="auto"/>
+              <w:jc w:val="left"/>
+            </w:pPr>
+            <w:r>
+              <w:rPr>
+                <w:rFonts w:ascii="Arial" w:hAnsi="Arial"/>
+                <w:sz w:val="16"/>
+              </w:rPr>
+              <w:t xml:space="preserve">30 · 27 · 0.38</w:t>
+            </w:r>
+          </w:p>
+        </w:tc>
+        <w:tc>
+          <w:tcPr/>
+          <w:p>
+            <w:pPr>
+              <w:pStyle w:val="Compact"/>
+              <w:spacing w:after="0" w:before="20" w:line="240" w:lineRule="auto"/>
+              <w:jc w:val="left"/>
+            </w:pPr>
+            <w:r>
+              <w:rPr>
+                <w:rFonts w:ascii="Arial" w:hAnsi="Arial"/>
+                <w:sz w:val="16"/>
+              </w:rPr>
+              <w:t xml:space="preserve">33 · 34 · 0.40</w:t>
+            </w:r>
+          </w:p>
+        </w:tc>
+      </w:tr>
+      <w:tr>
+        <w:trPr>
+          <w:cantSplit/>
+        </w:trPr>
+        <w:tc>
+          <w:tcPr/>
+          <w:p>
+            <w:pPr>
+              <w:pStyle w:val="Compact"/>
+              <w:spacing w:after="0" w:before="20" w:line="240" w:lineRule="auto"/>
+              <w:jc w:val="left"/>
+            </w:pPr>
+            <w:r>
+              <w:rPr>
+                <w:rFonts w:ascii="Arial" w:hAnsi="Arial"/>
+                <w:sz w:val="16"/>
+              </w:rPr>
+              <w:t xml:space="preserve">Fixed m³/s: caught · false payouts · Peirce</w:t>
+            </w:r>
+          </w:p>
+        </w:tc>
+        <w:tc>
+          <w:tcPr/>
+          <w:p>
+            <w:pPr>
+              <w:pStyle w:val="Compact"/>
+              <w:spacing w:after="0" w:before="20" w:line="240" w:lineRule="auto"/>
+              <w:jc w:val="left"/>
+            </w:pPr>
+            <w:r>
+              <w:rPr>
+                <w:rFonts w:ascii="Arial" w:hAnsi="Arial"/>
+                <w:sz w:val="16"/>
+              </w:rPr>
+              <w:t xml:space="preserve">6 · 10 · 0.06</w:t>
+            </w:r>
+          </w:p>
+        </w:tc>
+        <w:tc>
+          <w:tcPr/>
+          <w:p>
+            <w:pPr>
+              <w:pStyle w:val="Compact"/>
+              <w:spacing w:after="0" w:before="20" w:line="240" w:lineRule="auto"/>
+              <w:jc w:val="left"/>
+            </w:pPr>
+            <w:r>
+              <w:rPr>
+                <w:rFonts w:ascii="Arial" w:hAnsi="Arial"/>
+                <w:sz w:val="16"/>
+              </w:rPr>
+              <w:t xml:space="preserve">26 · 30 · 0.30</w:t>
+            </w:r>
+          </w:p>
+        </w:tc>
+      </w:tr>
+      <w:tr>
+        <w:trPr>
+          <w:cantSplit/>
+        </w:trPr>
+        <w:tc>
+          <w:tcPr/>
+          <w:p>
+            <w:pPr>
+              <w:pStyle w:val="Compact"/>
+              <w:spacing w:after="0" w:before="20" w:line="240" w:lineRule="auto"/>
+              <w:jc w:val="left"/>
+            </w:pPr>
+            <w:r>
+              <w:rPr>
+                <w:rFonts w:ascii="Arial" w:hAnsi="Arial"/>
+                <w:sz w:val="16"/>
+              </w:rPr>
+              <w:t xml:space="preserve">McNemar, flood years caught by one only (RP vs fixed)</w:t>
+            </w:r>
+          </w:p>
+        </w:tc>
+        <w:tc>
+          <w:tcPr/>
+          <w:p>
+            <w:pPr>
+              <w:pStyle w:val="Compact"/>
+              <w:spacing w:after="0" w:before="20" w:line="240" w:lineRule="auto"/>
+              <w:jc w:val="left"/>
+            </w:pPr>
+            <w:r>
+              <w:rPr>
+                <w:rFonts w:ascii="Arial" w:hAnsi="Arial"/>
+                <w:sz w:val="16"/>
+              </w:rPr>
+              <w:t xml:space="preserve">24 vs 0, p = 1.2 × 10</w:t>
+            </w:r>
+            <w:r>
+              <w:rPr>
+                <w:rFonts w:ascii="Arial" w:hAnsi="Arial"/>
+                <w:sz w:val="16"/>
+                <w:vertAlign w:val="superscript"/>
+              </w:rPr>
+              <w:t xml:space="preserve">-7</w:t>
+            </w:r>
+          </w:p>
+        </w:tc>
+        <w:tc>
+          <w:tcPr/>
+          <w:p>
+            <w:pPr>
+              <w:pStyle w:val="Compact"/>
+              <w:spacing w:after="0" w:before="20" w:line="240" w:lineRule="auto"/>
+              <w:jc w:val="left"/>
+            </w:pPr>
+            <w:r>
+              <w:rPr>
+                <w:rFonts w:ascii="Arial" w:hAnsi="Arial"/>
+                <w:sz w:val="16"/>
+              </w:rPr>
+              <w:t xml:space="preserve">9 vs 2, p = 0.065</w:t>
+            </w:r>
+          </w:p>
+        </w:tc>
+      </w:tr>
+    </w:tbl>
+    <w:bookmarkEnd w:id="53"/>
+    <w:bookmarkEnd w:id="54"/>
+    <w:bookmarkStart w:id="55" w:name="discussion"/>
+    <w:p>
+      <w:pPr>
+        <w:pStyle w:val="Heading2"/>
+      </w:pPr>
+      <w:r>
+        <w:t xml:space="preserve">5. Discussion</w:t>
+      </w:r>
+    </w:p>
+    <w:p>
+      <w:pPr>
+        <w:pStyle w:val="FirstParagraph"/>
+      </w:pPr>
+      <w:r>
         <w:rPr>
           <w:bCs/>
           <w:b/>
@@ -8758,31 +9407,37 @@
           <w:bCs/>
           <w:b/>
         </w:rPr>
-        <w:t xml:space="preserve">One level for all sites hides the frequency.</w:t>
-      </w:r>
-      <w:r>
-        <w:t xml:space="preserve"> </w:t>
-      </w:r>
-      <w:r>
-        <w:t xml:space="preserve">An absolute level is easy to read and to settle, but it pays at a</w:t>
-      </w:r>
-      <w:r>
-        <w:t xml:space="preserve"> </w:t>
-      </w:r>
-      <w:r>
-        <w:t xml:space="preserve">different frequency at every site, which Model Library [14] showed for drought and which holds more strongly for</w:t>
-      </w:r>
-      <w:r>
-        <w:t xml:space="preserve"> </w:t>
-      </w:r>
-      <w:r>
-        <w:t xml:space="preserve">floods: catchments differ in size, climate and regulation, and dividing by area does not remove the spread. Each site needs its</w:t>
-      </w:r>
-      <w:r>
-        <w:t xml:space="preserve"> </w:t>
-      </w:r>
-      <w:r>
-        <w:t xml:space="preserve">own level, set from its own record; the agreed level can then be written into the contract in m³/s or mm for settlement.</w:t>
+        <w:t xml:space="preserve">A better model narrows the gap, it does not close it.</w:t>
+      </w:r>
+      <w:r>
+        <w:t xml:space="preserve"> </w:t>
+      </w:r>
+      <w:r>
+        <w:t xml:space="preserve">GloFAS 5.0 removed most of the low bias, and with it most of</w:t>
+      </w:r>
+      <w:r>
+        <w:t xml:space="preserve"> </w:t>
+      </w:r>
+      <w:r>
+        <w:t xml:space="preserve">the penalty for writing the trigger in m³/s. The trigger defined by the model's own frequency still caught more flood years, and</w:t>
+      </w:r>
+      <w:r>
+        <w:t xml:space="preserve"> </w:t>
+      </w:r>
+      <w:r>
+        <w:t xml:space="preserve">it is the one that does not depend on the model version: when a reanalysis is upgraded, a level written in the model's own terms</w:t>
+      </w:r>
+      <w:r>
+        <w:t xml:space="preserve"> </w:t>
+      </w:r>
+      <w:r>
+        <w:t xml:space="preserve">is re-derived from the new record, while a fixed flow can suddenly pay far more or far less often. Basis risk was the same with</w:t>
+      </w:r>
+      <w:r>
+        <w:t xml:space="preserve"> </w:t>
+      </w:r>
+      <w:r>
+        <w:t xml:space="preserve">both versions; the model's ranking of years, not its magnitudes, limits the trigger.</w:t>
       </w:r>
     </w:p>
     <w:p>
@@ -8794,43 +9449,31 @@
           <w:bCs/>
           <w:b/>
         </w:rPr>
-        <w:t xml:space="preserve">Rainfall or river flow.</w:t>
-      </w:r>
-      <w:r>
-        <w:t xml:space="preserve"> </w:t>
-      </w:r>
-      <w:r>
-        <w:t xml:space="preserve">In this basin, flood years follow wet winters more than single storms: reservoirs absorb the</w:t>
-      </w:r>
-      <w:r>
-        <w:t xml:space="preserve"> </w:t>
-      </w:r>
-      <w:r>
-        <w:t xml:space="preserve">first rains and spill or release once full, and soils and aquifers fill slowly. A season total therefore ranked flood years as</w:t>
-      </w:r>
-      <w:r>
-        <w:t xml:space="preserve"> </w:t>
-      </w:r>
-      <w:r>
-        <w:t xml:space="preserve">well as the river model, and storm rainfall did not. For prompt flood payouts that favours river flow: a season total is known</w:t>
-      </w:r>
-      <w:r>
-        <w:t xml:space="preserve"> </w:t>
-      </w:r>
-      <w:r>
-        <w:t xml:space="preserve">only at the end of April and marks a flood year, not the flood, so it suits seasonal or anticipatory finance rather than event</w:t>
-      </w:r>
-      <w:r>
-        <w:t xml:space="preserve"> </w:t>
-      </w:r>
-      <w:r>
-        <w:t xml:space="preserve">cover. Where both indices are available, requiring them to agree is a simple way to cut false payouts; it lowers the payout</w:t>
-      </w:r>
-      <w:r>
-        <w:t xml:space="preserve"> </w:t>
-      </w:r>
-      <w:r>
-        <w:t xml:space="preserve">frequency, which the price must reflect.</w:t>
+        <w:t xml:space="preserve">One level for all sites hides the frequency.</w:t>
+      </w:r>
+      <w:r>
+        <w:t xml:space="preserve"> </w:t>
+      </w:r>
+      <w:r>
+        <w:t xml:space="preserve">An absolute level is easy to read and to settle, but it pays at a</w:t>
+      </w:r>
+      <w:r>
+        <w:t xml:space="preserve"> </w:t>
+      </w:r>
+      <w:r>
+        <w:t xml:space="preserve">different frequency at every site, which Model Library [14] showed for drought and which holds more strongly for</w:t>
+      </w:r>
+      <w:r>
+        <w:t xml:space="preserve"> </w:t>
+      </w:r>
+      <w:r>
+        <w:t xml:space="preserve">floods: catchments differ in size, climate and regulation, and dividing by area does not remove the spread. Each site needs its</w:t>
+      </w:r>
+      <w:r>
+        <w:t xml:space="preserve"> </w:t>
+      </w:r>
+      <w:r>
+        <w:t xml:space="preserve">own level, set from its own record; the agreed level can then be written into the contract in m³/s or mm for settlement.</w:t>
       </w:r>
     </w:p>
     <w:p>
@@ -8842,43 +9485,43 @@
           <w:bCs/>
           <w:b/>
         </w:rPr>
-        <w:t xml:space="preserve">Basis risk remains, and can be screened.</w:t>
-      </w:r>
-      <w:r>
-        <w:t xml:space="preserve"> </w:t>
-      </w:r>
-      <w:r>
-        <w:t xml:space="preserve">Even the better trigger paid without a flood in 47%</w:t>
-      </w:r>
-      <w:r>
-        <w:t xml:space="preserve"> </w:t>
-      </w:r>
-      <w:r>
-        <w:t xml:space="preserve">of payouts at 1-in-5. For a buyer that is a large risk, and in a regulated basin it is expected: reservoirs cut and delay</w:t>
-      </w:r>
-      <w:r>
-        <w:t xml:space="preserve"> </w:t>
-      </w:r>
-      <w:r>
-        <w:t xml:space="preserve">flood peaks in some years and not in others, which a model without the reservoirs' operation cannot reproduce. The strong link</w:t>
-      </w:r>
-      <w:r>
-        <w:t xml:space="preserve"> </w:t>
-      </w:r>
-      <w:r>
-        <w:t xml:space="preserve">between rank correlation and the share of floods caught offers a practical screen: a few years of local evidence (a short gauge</w:t>
-      </w:r>
-      <w:r>
-        <w:t xml:space="preserve"> </w:t>
-      </w:r>
-      <w:r>
-        <w:t xml:space="preserve">record, flood marks, satellite flood extents or insurance claims) give a rank correlation that indicates, before the policy is</w:t>
-      </w:r>
-      <w:r>
-        <w:t xml:space="preserve"> </w:t>
-      </w:r>
-      <w:r>
-        <w:t xml:space="preserve">written, whether the global index can carry the trigger or needs local calibration.</w:t>
+        <w:t xml:space="preserve">Rainfall or river flow.</w:t>
+      </w:r>
+      <w:r>
+        <w:t xml:space="preserve"> </w:t>
+      </w:r>
+      <w:r>
+        <w:t xml:space="preserve">In this basin, flood years follow wet winters more than single storms: reservoirs absorb the</w:t>
+      </w:r>
+      <w:r>
+        <w:t xml:space="preserve"> </w:t>
+      </w:r>
+      <w:r>
+        <w:t xml:space="preserve">first rains and spill or release once full, and soils and aquifers fill slowly. A season total therefore ranked flood years as</w:t>
+      </w:r>
+      <w:r>
+        <w:t xml:space="preserve"> </w:t>
+      </w:r>
+      <w:r>
+        <w:t xml:space="preserve">well as the river model, and storm rainfall did not. For prompt flood payouts that favours river flow: a season total is known</w:t>
+      </w:r>
+      <w:r>
+        <w:t xml:space="preserve"> </w:t>
+      </w:r>
+      <w:r>
+        <w:t xml:space="preserve">only at the end of April and marks a flood year, not the flood, so it suits seasonal or anticipatory finance rather than event</w:t>
+      </w:r>
+      <w:r>
+        <w:t xml:space="preserve"> </w:t>
+      </w:r>
+      <w:r>
+        <w:t xml:space="preserve">cover. Where both indices are available, requiring them to agree is a simple way to cut false payouts; it lowers the payout</w:t>
+      </w:r>
+      <w:r>
+        <w:t xml:space="preserve"> </w:t>
+      </w:r>
+      <w:r>
+        <w:t xml:space="preserve">frequency, which the price must reflect.</w:t>
       </w:r>
     </w:p>
     <w:p>
@@ -8890,19 +9533,67 @@
           <w:bCs/>
           <w:b/>
         </w:rPr>
+        <w:t xml:space="preserve">Basis risk remains, and can be screened.</w:t>
+      </w:r>
+      <w:r>
+        <w:t xml:space="preserve"> </w:t>
+      </w:r>
+      <w:r>
+        <w:t xml:space="preserve">Even the better trigger paid without a flood in 47%</w:t>
+      </w:r>
+      <w:r>
+        <w:t xml:space="preserve"> </w:t>
+      </w:r>
+      <w:r>
+        <w:t xml:space="preserve">of payouts at 1-in-5. For a buyer that is a large risk, and in a regulated basin it is expected: reservoirs cut and delay</w:t>
+      </w:r>
+      <w:r>
+        <w:t xml:space="preserve"> </w:t>
+      </w:r>
+      <w:r>
+        <w:t xml:space="preserve">flood peaks in some years and not in others, which a model without the reservoirs' operation cannot reproduce. The strong link</w:t>
+      </w:r>
+      <w:r>
+        <w:t xml:space="preserve"> </w:t>
+      </w:r>
+      <w:r>
+        <w:t xml:space="preserve">between rank correlation and the share of floods caught offers a practical screen: a few years of local evidence (a short gauge</w:t>
+      </w:r>
+      <w:r>
+        <w:t xml:space="preserve"> </w:t>
+      </w:r>
+      <w:r>
+        <w:t xml:space="preserve">record, flood marks, satellite flood extents or insurance claims) give a rank correlation that indicates, before the policy is</w:t>
+      </w:r>
+      <w:r>
+        <w:t xml:space="preserve"> </w:t>
+      </w:r>
+      <w:r>
+        <w:t xml:space="preserve">written, whether the global index can carry the trigger or needs local calibration.</w:t>
+      </w:r>
+    </w:p>
+    <w:p>
+      <w:pPr>
+        <w:pStyle w:val="BodyText"/>
+      </w:pPr>
+      <w:r>
+        <w:rPr>
+          <w:bCs/>
+          <w:b/>
+        </w:rPr>
         <w:t xml:space="preserve">Limits.</w:t>
       </w:r>
       <w:r>
         <w:t xml:space="preserve"> </w:t>
       </w:r>
       <w:r>
-        <w:t xml:space="preserve">One basin, strongly regulated and semi-arid, so the size of the bias will differ elsewhere. GloFAS 4.0;</w:t>
-      </w:r>
-      <w:r>
-        <w:t xml:space="preserve"> </w:t>
-      </w:r>
-      <w:r>
-        <w:t xml:space="preserve">version 5.0 of the reanalysis is the next test. Daily means, so instantaneous peaks are higher than the values used. 17 to 24</w:t>
+        <w:t xml:space="preserve">One basin, strongly regulated and semi-arid, so the size of the bias will differ elsewhere. The four-way and</w:t>
+      </w:r>
+      <w:r>
+        <w:t xml:space="preserve"> </w:t>
+      </w:r>
+      <w:r>
+        <w:t xml:space="preserve">rainfall comparisons use GloFAS 4.0; GloFAS 5.0 was compared for the two river-flow triggers. Daily means, so instantaneous peaks are higher than the values used. 17 to 24</w:t>
       </w:r>
       <w:r>
         <w:t xml:space="preserve"> </w:t>
@@ -8935,8 +9626,8 @@
         <w:t xml:space="preserve">where and how losses occur.</w:t>
       </w:r>
     </w:p>
-    <w:bookmarkEnd w:id="51"/>
-    <w:bookmarkStart w:id="52" w:name="conclusions"/>
+    <w:bookmarkEnd w:id="55"/>
+    <w:bookmarkStart w:id="56" w:name="conclusions"/>
     <w:p>
       <w:pPr>
         <w:pStyle w:val="Heading2"/>
@@ -8950,7 +9641,19 @@
         <w:pStyle w:val="FirstParagraph"/>
       </w:pPr>
       <w:r>
-        <w:t xml:space="preserve">On 14 gauges in the Guadalquivir basin, the GloFAS reanalysis saw floods at about a fifth of their measured size.</w:t>
+        <w:t xml:space="preserve">On 14 gauges in the Guadalquivir basin, GloFAS 4.0 saw floods at about a fifth of their measured size; GloFAS 5.0</w:t>
+      </w:r>
+      <w:r>
+        <w:t xml:space="preserve"> </w:t>
+      </w:r>
+      <w:r>
+        <w:t xml:space="preserve">saw them at about their measured size (1.05), which made a trigger written in m³/s work, though still less well</w:t>
+      </w:r>
+      <w:r>
+        <w:t xml:space="preserve"> </w:t>
+      </w:r>
+      <w:r>
+        <w:t xml:space="preserve">than one written as the model's own return period, and left basis risk unchanged.</w:t>
       </w:r>
       <w:r>
         <w:t xml:space="preserve"> </w:t>
@@ -8998,11 +9701,11 @@
         <w:t xml:space="preserve"> </w:t>
       </w:r>
       <w:r>
-        <w:t xml:space="preserve">written; and calibrate locally before the trigger enters a contract.</w:t>
+        <w:t xml:space="preserve">written; and calibrate locally before the trigger enters a contract. Re-test every trigger when the model is upgraded.</w:t>
       </w:r>
     </w:p>
-    <w:bookmarkEnd w:id="52"/>
-    <w:bookmarkStart w:id="53" w:name="data-and-code-availability"/>
+    <w:bookmarkEnd w:id="56"/>
+    <w:bookmarkStart w:id="57" w:name="data-and-code-availability"/>
     <w:p>
       <w:pPr>
         <w:pStyle w:val="Heading2"/>
@@ -9022,7 +9725,7 @@
         <w:t xml:space="preserve"> </w:t>
       </w:r>
       <w:r>
-        <w:t xml:space="preserve">and at their GloFAS cells; catchment rainfall maxima and the catchments and rainfall cells behind them; gauge list), the result files, the figures, the notebook that reproduces every number, the shared</w:t>
+        <w:t xml:space="preserve">and at their GloFAS 4.0 and 5.0 cells; catchment rainfall maxima and the catchments and rainfall cells behind them; gauge list), the result files, the figures, the notebook that reproduces every number, the shared</w:t>
       </w:r>
       <w:r>
         <w:t xml:space="preserve"> </w:t>
@@ -9049,8 +9752,8 @@
         <w:t xml:space="preserve">(code MIT; text, figures and derived data CC BY 4.0). An interactive version with maps is at https://kai-water.charkaks0.workers.dev/case-guadalquivir.</w:t>
       </w:r>
     </w:p>
-    <w:bookmarkEnd w:id="53"/>
-    <w:bookmarkStart w:id="54" w:name="acknowledgements-and-competing-interests"/>
+    <w:bookmarkEnd w:id="57"/>
+    <w:bookmarkStart w:id="58" w:name="acknowledgements-and-competing-interests"/>
     <w:p>
       <w:pPr>
         <w:pStyle w:val="Heading2"/>
@@ -9083,7 +9786,13 @@
         <w:t xml:space="preserve"> </w:t>
       </w:r>
       <w:r>
-        <w:t xml:space="preserve">Copernicus Emergency Management Service information 2026 (GloFAS 4.0), served by Open-Meteo (CC BY 4.0). Rainfall: data</w:t>
+        <w:t xml:space="preserve">Copernicus Emergency Management Service information 2026 (GloFAS 4.0, served by Open-Meteo, CC BY 4.0; GloFAS 5.0, from the</w:t>
+      </w:r>
+      <w:r>
+        <w:t xml:space="preserve"> </w:t>
+      </w:r>
+      <w:r>
+        <w:t xml:space="preserve">Copernicus Early Warning Data Store). Rainfall: data</w:t>
       </w:r>
       <w:r>
         <w:t xml:space="preserve"> </w:t>
@@ -9110,8 +9819,8 @@
         <w:t xml:space="preserve">studies (KAI-Hydro).</w:t>
       </w:r>
     </w:p>
-    <w:bookmarkEnd w:id="54"/>
-    <w:bookmarkStart w:id="55" w:name="references"/>
+    <w:bookmarkEnd w:id="58"/>
+    <w:bookmarkStart w:id="59" w:name="references"/>
     <w:p>
       <w:pPr>
         <w:pStyle w:val="Heading2"/>
@@ -9551,11 +10260,11 @@
         <w:t xml:space="preserve"> </w:t>
       </w:r>
       <w:r>
-        <w:t xml:space="preserve">Cite as: Kakooza, C. (2026) River flow or rainfall? Writing parametric flood triggers from global data, tested gauge by gauge in the Guadalquivir basin, Spain. Version 1.0. Zenodo.</w:t>
+        <w:t xml:space="preserve">Cite as: Kakooza, C. (2026) River flow or rainfall, GloFAS 4.0 or 5.0? Writing parametric flood triggers from global data, tested gauge by gauge in the Guadalquivir basin, Spain. Version 2.0. Zenodo.</w:t>
       </w:r>
     </w:p>
-    <w:bookmarkEnd w:id="55"/>
-    <w:bookmarkEnd w:id="56"/>
+    <w:bookmarkEnd w:id="59"/>
+    <w:bookmarkEnd w:id="60"/>
     <w:sectPr>
       <w:footerReference w:type="default" r:id="rId9"/>
       <w:pgSz w:w="11906" w:h="16838"/>

</xml_diff>